<commit_message>
Informe del Sprint 1 en PDF y estado del sprint actualizado
Co-Authored-By: Claude Sonnet 5.5 <noreply@anthropic.com>
</commit_message>
<xml_diff>
--- a/03. Implementacion/Informe de Estado del Proyecto.docx
+++ b/03. Implementacion/Informe de Estado del Proyecto.docx
@@ -313,7 +313,7 @@
                 <w:b w:val="0"/>
                 <w:sz w:val="20"/>
               </w:rPr>
-              <w:t>HU01 tiene su evidencia completa (Acta de Constitución, backlog en Trello y Gantt); su tarjeta aún no está marcada como terminada.</w:t>
+              <w:t>Sprint 1 concluido: 4 de 4 historias terminadas. HU01 tiene su evidencia completa (Acta de Constitución firmada, backlog en Trello y Gantt).</w:t>
             </w:r>
           </w:p>
           <w:p>
@@ -322,7 +322,7 @@
                 <w:b w:val="0"/>
                 <w:sz w:val="20"/>
               </w:rPr>
-              <w:t>HU02 y HU03: los dos notebooks se ejecutaron con el dataset real (conteos, pares imagen-máscara, partición y cargador verificados); falta que el equipo marque sus tarjetas como terminadas. HU04 es la presentación del 12 de octubre.</w:t>
+              <w:t>HU02 y HU03: los dos notebooks se ejecutaron con el dataset real (conteos, pares imagen-máscara, partición y cargador verificados). HU04 es la presentación del Sprint 1, programada para el 12 de octubre.</w:t>
             </w:r>
           </w:p>
         </w:tc>
@@ -436,7 +436,7 @@
                 <w:b w:val="0"/>
                 <w:sz w:val="20"/>
               </w:rPr>
-              <w:t>Porcentaje de avance a la fecha: [completar].</w:t>
+              <w:t>Avance a la fecha: Sprint 1 al 100 % (4 de 4 historias); proyecto: 4 de 17 historias terminadas. Vamos según el cronograma.</w:t>
             </w:r>
           </w:p>
         </w:tc>
@@ -651,7 +651,7 @@
                 <w:b w:val="0"/>
                 <w:sz w:val="20"/>
               </w:rPr>
-              <w:t>Defectos: no aplica todavía (aún no hay código entregado).</w:t>
+              <w:t>Defectos: durante la ejecución con el dataset real se corrigieron en los notebooks la binarización de máscaras, el chequeo de duplicados del manifest y el umbral del hash perceptual; no quedan defectos abiertos.</w:t>
             </w:r>
           </w:p>
           <w:p>
@@ -1132,7 +1132,7 @@
                 <w:b w:val="0"/>
                 <w:sz w:val="20"/>
               </w:rPr>
-              <w:t>Terminar HU02 (análisis exploratorio) y HU03 (partición y cargador de datos).</w:t>
+              <w:t>Presentar el Sprint 1 el 12 de octubre y hacer la retrospectiva.</w:t>
             </w:r>
           </w:p>
           <w:p>
@@ -1181,15 +1181,6 @@
                 <w:bCs/>
               </w:rPr>
             </w:pPr>
-          </w:p>
-          <w:p>
-            <w:r>
-              <w:rPr>
-                <w:b w:val="0"/>
-                <w:sz w:val="20"/>
-              </w:rPr>
-              <w:t>Presentar el Sprint 1 el 12 de octubre y hacer la retrospectiva.</w:t>
-            </w:r>
           </w:p>
           <w:p>
             <w:r>

</xml_diff>